<commit_message>
I Made a github worklfow so that we work in the same manner and avoid doing stupid things.
I Updated the deliverable pdfs.
</commit_message>
<xml_diff>
--- a/20_oblig3.docx
+++ b/20_oblig3.docx
@@ -260,15 +260,7 @@
           <w:szCs w:val="24"/>
           <w:lang w:val="nb-NO"/>
         </w:rPr>
-        <w:t>kke-f</w:t>
-      </w:r>
-      <w:r>
-        <w:rPr>
-          <w:sz w:val="24"/>
-          <w:szCs w:val="24"/>
-          <w:lang w:val="nb-NO"/>
-        </w:rPr>
-        <w:t>unksjonelle krav:</w:t>
+        <w:t>kke-funksjonelle krav:</w:t>
       </w:r>
     </w:p>
     <w:p>
@@ -291,7 +283,39 @@
           <w:szCs w:val="24"/>
           <w:lang w:val="nb-NO"/>
         </w:rPr>
-        <w:t>Applikasjonen skal ha en responstid på maks 2-4 sekunder ved brukerinteraksjon.</w:t>
+        <w:t xml:space="preserve">Applikasjonen skal ha en responstid på maks 2 sekunder ved </w:t>
+      </w:r>
+      <w:r>
+        <w:rPr>
+          <w:sz w:val="24"/>
+          <w:szCs w:val="24"/>
+          <w:lang w:val="nb-NO"/>
+        </w:rPr>
+        <w:t xml:space="preserve">vanlig </w:t>
+      </w:r>
+      <w:r>
+        <w:rPr>
+          <w:sz w:val="24"/>
+          <w:szCs w:val="24"/>
+          <w:lang w:val="nb-NO"/>
+        </w:rPr>
+        <w:t>brukerinteraksjon</w:t>
+      </w:r>
+      <w:r>
+        <w:rPr>
+          <w:sz w:val="24"/>
+          <w:szCs w:val="24"/>
+          <w:lang w:val="nb-NO"/>
+        </w:rPr>
+        <w:t xml:space="preserve"> under normale nettverksforhold</w:t>
+      </w:r>
+      <w:r>
+        <w:rPr>
+          <w:sz w:val="24"/>
+          <w:szCs w:val="24"/>
+          <w:lang w:val="nb-NO"/>
+        </w:rPr>
+        <w:t>.</w:t>
       </w:r>
     </w:p>
     <w:p>
@@ -314,7 +338,23 @@
           <w:szCs w:val="24"/>
           <w:lang w:val="nb-NO"/>
         </w:rPr>
-        <w:t>Systemet skal være kompatibelt med mobiltelefoner og nettbrett.</w:t>
+        <w:t>Applikasjonen</w:t>
+      </w:r>
+      <w:r>
+        <w:rPr>
+          <w:sz w:val="24"/>
+          <w:szCs w:val="24"/>
+          <w:lang w:val="nb-NO"/>
+        </w:rPr>
+        <w:t xml:space="preserve"> skal være kompatibelt med </w:t>
+      </w:r>
+      <w:r>
+        <w:rPr>
+          <w:sz w:val="24"/>
+          <w:szCs w:val="24"/>
+          <w:lang w:val="nb-NO"/>
+        </w:rPr>
+        <w:t>Android versjon 8.0 (API 24) og nyere, samt støtte skjermstørrelser fra 5 til 11 tommer.</w:t>
       </w:r>
     </w:p>
     <w:p>
@@ -337,7 +377,15 @@
           <w:szCs w:val="24"/>
           <w:lang w:val="nb-NO"/>
         </w:rPr>
-        <w:t>Applikasjonen skal hente og vise oppdaterte data, med automatisk oppdatering minimum hvert 2. minutt.</w:t>
+        <w:t xml:space="preserve">Applikasjonen skal </w:t>
+      </w:r>
+      <w:r>
+        <w:rPr>
+          <w:sz w:val="24"/>
+          <w:szCs w:val="24"/>
+          <w:lang w:val="nb-NO"/>
+        </w:rPr>
+        <w:t>automatisk oppdatere data minst hvert 2. minutt.</w:t>
       </w:r>
     </w:p>
     <w:p>
@@ -360,7 +408,25 @@
           <w:szCs w:val="24"/>
           <w:lang w:val="nb-NO"/>
         </w:rPr>
-        <w:t>Koden skal være modulær og strukturert slik at løsningen er skalerbar og enkel å videreutvikle.</w:t>
+        <w:t>Applikasjonen skal ha en modulær arkitektur med tydelig separasjon mellom UI, logikk og datatilgang (</w:t>
+      </w:r>
+      <w:proofErr w:type="spellStart"/>
+      <w:r>
+        <w:rPr>
+          <w:sz w:val="24"/>
+          <w:szCs w:val="24"/>
+          <w:lang w:val="nb-NO"/>
+        </w:rPr>
+        <w:t>MVVM</w:t>
+      </w:r>
+      <w:proofErr w:type="spellEnd"/>
+      <w:r>
+        <w:rPr>
+          <w:sz w:val="24"/>
+          <w:szCs w:val="24"/>
+          <w:lang w:val="nb-NO"/>
+        </w:rPr>
+        <w:t>-arkitektur).</w:t>
       </w:r>
     </w:p>
     <w:p>
@@ -552,25 +618,39 @@
           <w:szCs w:val="24"/>
           <w:lang w:val="nb-NO"/>
         </w:rPr>
-        <w:t xml:space="preserve"> etter vikrite milepæler (</w:t>
-      </w:r>
-      <w:proofErr w:type="spellStart"/>
-      <w:r>
-        <w:rPr>
-          <w:sz w:val="24"/>
-          <w:szCs w:val="24"/>
-          <w:lang w:val="nb-NO"/>
-        </w:rPr>
-        <w:t>f.eks</w:t>
-      </w:r>
-      <w:proofErr w:type="spellEnd"/>
-      <w:r>
-        <w:rPr>
-          <w:sz w:val="24"/>
-          <w:szCs w:val="24"/>
-          <w:lang w:val="nb-NO"/>
-        </w:rPr>
-        <w:t xml:space="preserve">: MVP). Vi velger </w:t>
+        <w:t xml:space="preserve"> </w:t>
+      </w:r>
+      <w:r>
+        <w:rPr>
+          <w:sz w:val="24"/>
+          <w:szCs w:val="24"/>
+          <w:lang w:val="nb-NO"/>
+        </w:rPr>
+        <w:t xml:space="preserve">etter hver sprint og ved større </w:t>
+      </w:r>
+      <w:r>
+        <w:rPr>
+          <w:sz w:val="24"/>
+          <w:szCs w:val="24"/>
+          <w:lang w:val="nb-NO"/>
+        </w:rPr>
+        <w:t>milepæler (f.eks</w:t>
+      </w:r>
+      <w:r>
+        <w:rPr>
+          <w:sz w:val="24"/>
+          <w:szCs w:val="24"/>
+          <w:lang w:val="nb-NO"/>
+        </w:rPr>
+        <w:t>.</w:t>
+      </w:r>
+      <w:r>
+        <w:rPr>
+          <w:sz w:val="24"/>
+          <w:szCs w:val="24"/>
+          <w:lang w:val="nb-NO"/>
+        </w:rPr>
+        <w:t xml:space="preserve"> MVP). Vi velger </w:t>
       </w:r>
       <w:proofErr w:type="spellStart"/>
       <w:r>
@@ -827,7 +907,25 @@
           <w:szCs w:val="24"/>
           <w:lang w:val="nb-NO"/>
         </w:rPr>
-        <w:t xml:space="preserve">, word </w:t>
+        <w:t xml:space="preserve">, </w:t>
+      </w:r>
+      <w:proofErr w:type="spellStart"/>
+      <w:r>
+        <w:rPr>
+          <w:sz w:val="24"/>
+          <w:szCs w:val="24"/>
+          <w:lang w:val="nb-NO"/>
+        </w:rPr>
+        <w:t>word</w:t>
+      </w:r>
+      <w:proofErr w:type="spellEnd"/>
+      <w:r>
+        <w:rPr>
+          <w:sz w:val="24"/>
+          <w:szCs w:val="24"/>
+          <w:lang w:val="nb-NO"/>
+        </w:rPr>
+        <w:t xml:space="preserve"> </w:t>
       </w:r>
       <w:r>
         <w:rPr>
@@ -1020,7 +1118,7 @@
         <w:rFonts w:hint="default"/>
       </w:rPr>
     </w:lvl>
-    <w:lvl w:ilvl="1" w:tplc="FFFFFFFF" w:tentative="1">
+    <w:lvl w:ilvl="1" w:tplc="FFFFFFFF">
       <w:start w:val="1"/>
       <w:numFmt w:val="lowerLetter"/>
       <w:lvlText w:val="%2."/>
@@ -1029,7 +1127,7 @@
         <w:ind w:left="1440" w:hanging="360"/>
       </w:pPr>
     </w:lvl>
-    <w:lvl w:ilvl="2" w:tplc="FFFFFFFF" w:tentative="1">
+    <w:lvl w:ilvl="2" w:tplc="FFFFFFFF">
       <w:start w:val="1"/>
       <w:numFmt w:val="lowerRoman"/>
       <w:lvlText w:val="%3."/>

</xml_diff>